<commit_message>
Att relatorio & Readme 2
</commit_message>
<xml_diff>
--- a/doc/27958_doc.docx
+++ b/doc/27958_doc.docx
@@ -1098,7 +1098,15 @@
         <w:spacing w:after="60" w:line="276" w:lineRule="auto"/>
       </w:pPr>
       <w:r>
-        <w:t>Quantas avaliações têm estado Aprovado e quantas têm estado Reprovado?</w:t>
+        <w:t xml:space="preserve">Quantas avaliações têm </w:t>
+      </w:r>
+      <w:proofErr w:type="gramStart"/>
+      <w:r>
+        <w:t>estado Aprovado</w:t>
+      </w:r>
+      <w:proofErr w:type="gramEnd"/>
+      <w:r>
+        <w:t xml:space="preserve"> e quantas têm estado Reprovado?</w:t>
       </w:r>
     </w:p>
     <w:p>
@@ -13568,13 +13576,23 @@
               <w:t xml:space="preserve">Alunos em </w:t>
             </w:r>
             <w:proofErr w:type="spellStart"/>
+            <w:proofErr w:type="gramStart"/>
             <w:r>
               <w:rPr>
                 <w:rFonts w:ascii="Consolas" w:eastAsia="Consolas" w:hAnsi="Consolas" w:cs="Consolas"/>
                 <w:sz w:val="17"/>
                 <w:szCs w:val="17"/>
               </w:rPr>
-              <w:t>medias_alunos</w:t>
+              <w:t>medias</w:t>
+            </w:r>
+            <w:proofErr w:type="gramEnd"/>
+            <w:r>
+              <w:rPr>
+                <w:rFonts w:ascii="Consolas" w:eastAsia="Consolas" w:hAnsi="Consolas" w:cs="Consolas"/>
+                <w:sz w:val="17"/>
+                <w:szCs w:val="17"/>
+              </w:rPr>
+              <w:t>_alunos</w:t>
             </w:r>
             <w:proofErr w:type="spellEnd"/>
           </w:p>
@@ -15577,7 +15595,15 @@
       </w:r>
       <w:proofErr w:type="spellEnd"/>
       <w:r>
-        <w:t xml:space="preserve"> false) para o passo Registar erro, seguido de Abortar. Assim, uma falha numa transformação deixa registo no log e impede que as fases seguintes corram com dados incompletos. Para além deste log do job, o processo gera três ficheiros de erros ao nível dos dados:</w:t>
+        <w:t xml:space="preserve"> false) para o </w:t>
+      </w:r>
+      <w:proofErr w:type="gramStart"/>
+      <w:r>
+        <w:t>passo Registar</w:t>
+      </w:r>
+      <w:proofErr w:type="gramEnd"/>
+      <w:r>
+        <w:t xml:space="preserve"> erro, seguido de Abortar. Assim, uma falha numa transformação deixa registo no log e impede que as fases seguintes corram com dados incompletos. Para além deste log do job, o processo gera três ficheiros de erros ao nível dos dados:</w:t>
       </w:r>
     </w:p>
     <w:p>
@@ -16254,9 +16280,19 @@
                 <w:sz w:val="17"/>
                 <w:szCs w:val="17"/>
               </w:rPr>
-              <w:t>SELECT estado, COUNT(*)::</w:t>
-            </w:r>
-            <w:proofErr w:type="spellStart"/>
+              <w:t>SELECT estado, COUNT(*</w:t>
+            </w:r>
+            <w:proofErr w:type="gramStart"/>
+            <w:r>
+              <w:rPr>
+                <w:rFonts w:ascii="Consolas" w:eastAsia="Consolas" w:hAnsi="Consolas" w:cs="Consolas"/>
+                <w:sz w:val="17"/>
+                <w:szCs w:val="17"/>
+              </w:rPr>
+              <w:t>)::</w:t>
+            </w:r>
+            <w:proofErr w:type="spellStart"/>
+            <w:proofErr w:type="gramEnd"/>
             <w:r>
               <w:rPr>
                 <w:rFonts w:ascii="Consolas" w:eastAsia="Consolas" w:hAnsi="Consolas" w:cs="Consolas"/>
@@ -16407,25 +16443,53 @@
                 <w:sz w:val="17"/>
                 <w:szCs w:val="17"/>
               </w:rPr>
-              <w:t>, ROUND(AVG(nota),2)::</w:t>
-            </w:r>
-            <w:proofErr w:type="spellStart"/>
+              <w:t>, ROUND(AVG(nota),2</w:t>
+            </w:r>
+            <w:proofErr w:type="gramStart"/>
             <w:r>
               <w:rPr>
                 <w:rFonts w:ascii="Consolas" w:eastAsia="Consolas" w:hAnsi="Consolas" w:cs="Consolas"/>
                 <w:sz w:val="17"/>
                 <w:szCs w:val="17"/>
               </w:rPr>
-              <w:t>float</w:t>
-            </w:r>
-            <w:proofErr w:type="spellEnd"/>
+              <w:t>)::</w:t>
+            </w:r>
+            <w:proofErr w:type="spellStart"/>
+            <w:proofErr w:type="gramEnd"/>
             <w:r>
               <w:rPr>
                 <w:rFonts w:ascii="Consolas" w:eastAsia="Consolas" w:hAnsi="Consolas" w:cs="Consolas"/>
                 <w:sz w:val="17"/>
                 <w:szCs w:val="17"/>
               </w:rPr>
-              <w:t xml:space="preserve"> AS media FROM </w:t>
+              <w:t>float</w:t>
+            </w:r>
+            <w:proofErr w:type="spellEnd"/>
+            <w:r>
+              <w:rPr>
+                <w:rFonts w:ascii="Consolas" w:eastAsia="Consolas" w:hAnsi="Consolas" w:cs="Consolas"/>
+                <w:sz w:val="17"/>
+                <w:szCs w:val="17"/>
+              </w:rPr>
+              <w:t xml:space="preserve"> AS </w:t>
+            </w:r>
+            <w:proofErr w:type="gramStart"/>
+            <w:r>
+              <w:rPr>
+                <w:rFonts w:ascii="Consolas" w:eastAsia="Consolas" w:hAnsi="Consolas" w:cs="Consolas"/>
+                <w:sz w:val="17"/>
+                <w:szCs w:val="17"/>
+              </w:rPr>
+              <w:t>media</w:t>
+            </w:r>
+            <w:proofErr w:type="gramEnd"/>
+            <w:r>
+              <w:rPr>
+                <w:rFonts w:ascii="Consolas" w:eastAsia="Consolas" w:hAnsi="Consolas" w:cs="Consolas"/>
+                <w:sz w:val="17"/>
+                <w:szCs w:val="17"/>
+              </w:rPr>
+              <w:t xml:space="preserve"> FROM </w:t>
             </w:r>
             <w:proofErr w:type="spellStart"/>
             <w:r>
@@ -16600,9 +16664,19 @@
                 <w:sz w:val="17"/>
                 <w:szCs w:val="17"/>
               </w:rPr>
-              <w:t>, COUNT(*)::</w:t>
-            </w:r>
-            <w:proofErr w:type="spellStart"/>
+              <w:t>, COUNT(*</w:t>
+            </w:r>
+            <w:proofErr w:type="gramStart"/>
+            <w:r>
+              <w:rPr>
+                <w:rFonts w:ascii="Consolas" w:eastAsia="Consolas" w:hAnsi="Consolas" w:cs="Consolas"/>
+                <w:sz w:val="17"/>
+                <w:szCs w:val="17"/>
+              </w:rPr>
+              <w:t>)::</w:t>
+            </w:r>
+            <w:proofErr w:type="spellStart"/>
+            <w:proofErr w:type="gramEnd"/>
             <w:r>
               <w:rPr>
                 <w:rFonts w:ascii="Consolas" w:eastAsia="Consolas" w:hAnsi="Consolas" w:cs="Consolas"/>
@@ -17133,35 +17207,56 @@
             </w:pPr>
             <w:r>
               <w:rPr>
-                <w:i/>
-                <w:iCs/>
-                <w:sz w:val="20"/>
-                <w:szCs w:val="20"/>
-                <w:highlight w:val="yellow"/>
-              </w:rPr>
-              <w:t xml:space="preserve">[INSERIR PRINT: QR </w:t>
-            </w:r>
-            <w:proofErr w:type="spellStart"/>
-            <w:r>
-              <w:rPr>
-                <w:i/>
-                <w:iCs/>
-                <w:sz w:val="20"/>
-                <w:szCs w:val="20"/>
-                <w:highlight w:val="yellow"/>
-              </w:rPr>
-              <w:t>Code</w:t>
-            </w:r>
-            <w:proofErr w:type="spellEnd"/>
-            <w:r>
-              <w:rPr>
-                <w:i/>
-                <w:iCs/>
-                <w:sz w:val="20"/>
-                <w:szCs w:val="20"/>
-                <w:highlight w:val="yellow"/>
-              </w:rPr>
-              <w:t xml:space="preserve"> com a ligação para o vídeo de demonstração]</w:t>
+                <w:noProof/>
+              </w:rPr>
+              <w:drawing>
+                <wp:inline distT="0" distB="0" distL="0" distR="0" wp14:anchorId="67F58FE4" wp14:editId="3CA3A51C">
+                  <wp:extent cx="3810000" cy="3810000"/>
+                  <wp:effectExtent l="0" t="0" r="0" b="0"/>
+                  <wp:docPr id="1487715797" name="Imagem 1"/>
+                  <wp:cNvGraphicFramePr>
+                    <a:graphicFrameLocks xmlns:a="http://schemas.openxmlformats.org/drawingml/2006/main" noChangeAspect="1"/>
+                  </wp:cNvGraphicFramePr>
+                  <a:graphic xmlns:a="http://schemas.openxmlformats.org/drawingml/2006/main">
+                    <a:graphicData uri="http://schemas.openxmlformats.org/drawingml/2006/picture">
+                      <pic:pic xmlns:pic="http://schemas.openxmlformats.org/drawingml/2006/picture">
+                        <pic:nvPicPr>
+                          <pic:cNvPr id="0" name="Picture 1"/>
+                          <pic:cNvPicPr>
+                            <a:picLocks noChangeAspect="1" noChangeArrowheads="1"/>
+                          </pic:cNvPicPr>
+                        </pic:nvPicPr>
+                        <pic:blipFill>
+                          <a:blip r:embed="rId22">
+                            <a:extLst>
+                              <a:ext uri="{28A0092B-C50C-407E-A947-70E740481C1C}">
+                                <a14:useLocalDpi xmlns:a14="http://schemas.microsoft.com/office/drawing/2010/main" val="0"/>
+                              </a:ext>
+                            </a:extLst>
+                          </a:blip>
+                          <a:srcRect/>
+                          <a:stretch>
+                            <a:fillRect/>
+                          </a:stretch>
+                        </pic:blipFill>
+                        <pic:spPr bwMode="auto">
+                          <a:xfrm>
+                            <a:off x="0" y="0"/>
+                            <a:ext cx="3810000" cy="3810000"/>
+                          </a:xfrm>
+                          <a:prstGeom prst="rect">
+                            <a:avLst/>
+                          </a:prstGeom>
+                          <a:noFill/>
+                          <a:ln>
+                            <a:noFill/>
+                          </a:ln>
+                        </pic:spPr>
+                      </pic:pic>
+                    </a:graphicData>
+                  </a:graphic>
+                </wp:inline>
+              </w:drawing>
             </w:r>
           </w:p>
         </w:tc>
@@ -17211,7 +17306,10 @@
         <w:jc w:val="center"/>
       </w:pPr>
       <w:r>
-        <w:t>Ligação direta: &lt;inserir ligação do vídeo&gt;</w:t>
+        <w:t xml:space="preserve">Ligação direta: </w:t>
+      </w:r>
+      <w:r>
+        <w:t>https://drive.google.com/file/d/1FSuroS-DaTBrt3Jyl7owjVdktuPK33Ls/view?usp=sharing</w:t>
       </w:r>
     </w:p>
     <w:p>
@@ -17247,7 +17345,7 @@
         <w:jc w:val="both"/>
       </w:pPr>
       <w:r>
-        <w:t>O trabalho serviu ainda para perceber que grande parte do esforço num ETL está na qualidade dos dados e nos detalhes técnicos de cada passo. As principais dificuldades e as soluções adotadas foram as seguintes:</w:t>
+        <w:t>As principais dificuldades e as soluções adotadas foram as seguintes:</w:t>
       </w:r>
     </w:p>
     <w:tbl>
@@ -17550,7 +17648,23 @@
                 <w:sz w:val="19"/>
                 <w:szCs w:val="19"/>
               </w:rPr>
-              <w:t xml:space="preserve"> inferia o tipo Date; todos os campos do CSV passaram a ser lidos como </w:t>
+              <w:t xml:space="preserve"> inferia o </w:t>
+            </w:r>
+            <w:proofErr w:type="gramStart"/>
+            <w:r>
+              <w:rPr>
+                <w:sz w:val="19"/>
+                <w:szCs w:val="19"/>
+              </w:rPr>
+              <w:t>tipo Date</w:t>
+            </w:r>
+            <w:proofErr w:type="gramEnd"/>
+            <w:r>
+              <w:rPr>
+                <w:sz w:val="19"/>
+                <w:szCs w:val="19"/>
+              </w:rPr>
+              <w:t xml:space="preserve">; todos os campos do CSV passaram a ser lidos como </w:t>
             </w:r>
             <w:proofErr w:type="spellStart"/>
             <w:r>
@@ -18126,74 +18240,6 @@
         <w:spacing w:after="60" w:line="276" w:lineRule="auto"/>
       </w:pPr>
       <w:r>
-        <w:t xml:space="preserve">Parametrizar os caminhos dos ficheiros com variáveis do </w:t>
-      </w:r>
-      <w:proofErr w:type="spellStart"/>
-      <w:r>
-        <w:t>Kettle</w:t>
-      </w:r>
-      <w:proofErr w:type="spellEnd"/>
-      <w:r>
-        <w:t>, para o processo correr em qualquer computador sem alterações.</w:t>
-      </w:r>
-    </w:p>
-    <w:p>
-      <w:pPr>
-        <w:pStyle w:val="PargrafodaLista"/>
-        <w:numPr>
-          <w:ilvl w:val="0"/>
-          <w:numId w:val="2"/>
-        </w:numPr>
-        <w:spacing w:after="60" w:line="276" w:lineRule="auto"/>
-      </w:pPr>
-      <w:r>
-        <w:t xml:space="preserve">Modelar um *data </w:t>
-      </w:r>
-      <w:proofErr w:type="spellStart"/>
-      <w:r>
-        <w:t>mart</w:t>
-      </w:r>
-      <w:proofErr w:type="spellEnd"/>
-      <w:r>
-        <w:t>* com dimensões (aluno, UC, tempo) e uma tabela de factos de avaliações.</w:t>
-      </w:r>
-    </w:p>
-    <w:p>
-      <w:pPr>
-        <w:pStyle w:val="PargrafodaLista"/>
-        <w:numPr>
-          <w:ilvl w:val="0"/>
-          <w:numId w:val="2"/>
-        </w:numPr>
-        <w:spacing w:after="60" w:line="276" w:lineRule="auto"/>
-      </w:pPr>
-      <w:r>
-        <w:t>Exportar também em formatos como JSON e Apache Parquet, e enviar os ficheiros por SFTP.</w:t>
-      </w:r>
-    </w:p>
-    <w:p>
-      <w:pPr>
-        <w:pStyle w:val="PargrafodaLista"/>
-        <w:numPr>
-          <w:ilvl w:val="0"/>
-          <w:numId w:val="2"/>
-        </w:numPr>
-        <w:spacing w:after="60" w:line="276" w:lineRule="auto"/>
-      </w:pPr>
-      <w:r>
-        <w:t>Agendar a execução periódica do job e gerar relatórios em PDF.</w:t>
-      </w:r>
-    </w:p>
-    <w:p>
-      <w:pPr>
-        <w:pStyle w:val="PargrafodaLista"/>
-        <w:numPr>
-          <w:ilvl w:val="0"/>
-          <w:numId w:val="2"/>
-        </w:numPr>
-        <w:spacing w:after="60" w:line="276" w:lineRule="auto"/>
-      </w:pPr>
-      <w:r>
         <w:t xml:space="preserve">Anonimizar os dados pessoais com técnicas mais fortes, como </w:t>
       </w:r>
       <w:proofErr w:type="spellStart"/>
@@ -18282,20 +18328,45 @@
         </w:numPr>
         <w:spacing w:after="80" w:line="276" w:lineRule="auto"/>
       </w:pPr>
+      <w:proofErr w:type="spellStart"/>
       <w:r>
         <w:rPr>
           <w:sz w:val="21"/>
           <w:szCs w:val="21"/>
         </w:rPr>
-        <w:t xml:space="preserve">Hitachi </w:t>
-      </w:r>
-      <w:proofErr w:type="spellStart"/>
+        <w:t>PostgreSQL</w:t>
+      </w:r>
+      <w:proofErr w:type="spellEnd"/>
       <w:r>
         <w:rPr>
           <w:sz w:val="21"/>
           <w:szCs w:val="21"/>
         </w:rPr>
-        <w:t>Vantara</w:t>
+        <w:t xml:space="preserve"> Global </w:t>
+      </w:r>
+      <w:proofErr w:type="spellStart"/>
+      <w:r>
+        <w:rPr>
+          <w:sz w:val="21"/>
+          <w:szCs w:val="21"/>
+        </w:rPr>
+        <w:t>Development</w:t>
+      </w:r>
+      <w:proofErr w:type="spellEnd"/>
+      <w:r>
+        <w:rPr>
+          <w:sz w:val="21"/>
+          <w:szCs w:val="21"/>
+        </w:rPr>
+        <w:t xml:space="preserve"> </w:t>
+      </w:r>
+      <w:proofErr w:type="spellStart"/>
+      <w:r>
+        <w:rPr>
+          <w:sz w:val="21"/>
+          <w:szCs w:val="21"/>
+        </w:rPr>
+        <w:t>Group</w:t>
       </w:r>
       <w:proofErr w:type="spellEnd"/>
       <w:r>
@@ -18311,7 +18382,7 @@
           <w:sz w:val="21"/>
           <w:szCs w:val="21"/>
         </w:rPr>
-        <w:t>Pentaho</w:t>
+        <w:t>PostgreSQL</w:t>
       </w:r>
       <w:proofErr w:type="spellEnd"/>
       <w:r>
@@ -18319,7 +18390,7 @@
           <w:sz w:val="21"/>
           <w:szCs w:val="21"/>
         </w:rPr>
-        <w:t xml:space="preserve"> Data </w:t>
+        <w:t xml:space="preserve"> </w:t>
       </w:r>
       <w:proofErr w:type="spellStart"/>
       <w:r>
@@ -18327,7 +18398,7 @@
           <w:sz w:val="21"/>
           <w:szCs w:val="21"/>
         </w:rPr>
-        <w:t>Integration</w:t>
+        <w:t>Documentation</w:t>
       </w:r>
       <w:proofErr w:type="spellEnd"/>
       <w:r>
@@ -18335,23 +18406,7 @@
           <w:sz w:val="21"/>
           <w:szCs w:val="21"/>
         </w:rPr>
-        <w:t xml:space="preserve"> (</w:t>
-      </w:r>
-      <w:proofErr w:type="spellStart"/>
-      <w:r>
-        <w:rPr>
-          <w:sz w:val="21"/>
-          <w:szCs w:val="21"/>
-        </w:rPr>
-        <w:t>Kettle</w:t>
-      </w:r>
-      <w:proofErr w:type="spellEnd"/>
-      <w:r>
-        <w:rPr>
-          <w:sz w:val="21"/>
-          <w:szCs w:val="21"/>
-        </w:rPr>
-        <w:t>): documentação oficial. https://help.hitachivantara.com (acedido em 22/10/2026).</w:t>
+        <w:t>. https://www.postgresql.org/docs/ (acedido em 22/10/2026).</w:t>
       </w:r>
     </w:p>
     <w:p>
@@ -18377,71 +18432,7 @@
           <w:sz w:val="21"/>
           <w:szCs w:val="21"/>
         </w:rPr>
-        <w:t xml:space="preserve"> Global </w:t>
-      </w:r>
-      <w:proofErr w:type="spellStart"/>
-      <w:r>
-        <w:rPr>
-          <w:sz w:val="21"/>
-          <w:szCs w:val="21"/>
-        </w:rPr>
-        <w:t>Development</w:t>
-      </w:r>
-      <w:proofErr w:type="spellEnd"/>
-      <w:r>
-        <w:rPr>
-          <w:sz w:val="21"/>
-          <w:szCs w:val="21"/>
-        </w:rPr>
-        <w:t xml:space="preserve"> </w:t>
-      </w:r>
-      <w:proofErr w:type="spellStart"/>
-      <w:r>
-        <w:rPr>
-          <w:sz w:val="21"/>
-          <w:szCs w:val="21"/>
-        </w:rPr>
-        <w:t>Group</w:t>
-      </w:r>
-      <w:proofErr w:type="spellEnd"/>
-      <w:r>
-        <w:rPr>
-          <w:sz w:val="21"/>
-          <w:szCs w:val="21"/>
-        </w:rPr>
-        <w:t xml:space="preserve">. </w:t>
-      </w:r>
-      <w:proofErr w:type="spellStart"/>
-      <w:r>
-        <w:rPr>
-          <w:sz w:val="21"/>
-          <w:szCs w:val="21"/>
-        </w:rPr>
-        <w:t>PostgreSQL</w:t>
-      </w:r>
-      <w:proofErr w:type="spellEnd"/>
-      <w:r>
-        <w:rPr>
-          <w:sz w:val="21"/>
-          <w:szCs w:val="21"/>
-        </w:rPr>
-        <w:t xml:space="preserve"> </w:t>
-      </w:r>
-      <w:proofErr w:type="spellStart"/>
-      <w:r>
-        <w:rPr>
-          <w:sz w:val="21"/>
-          <w:szCs w:val="21"/>
-        </w:rPr>
-        <w:t>Documentation</w:t>
-      </w:r>
-      <w:proofErr w:type="spellEnd"/>
-      <w:r>
-        <w:rPr>
-          <w:sz w:val="21"/>
-          <w:szCs w:val="21"/>
-        </w:rPr>
-        <w:t>. https://www.postgresql.org/docs/ (acedido em 22/10/2026).</w:t>
+        <w:t xml:space="preserve"> JDBC Driver. https://jdbc.postgresql.org/ (acedido em 22/10/2026).</w:t>
       </w:r>
     </w:p>
     <w:p>
@@ -18453,21 +18444,12 @@
         </w:numPr>
         <w:spacing w:after="80" w:line="276" w:lineRule="auto"/>
       </w:pPr>
-      <w:proofErr w:type="spellStart"/>
       <w:r>
         <w:rPr>
           <w:sz w:val="21"/>
           <w:szCs w:val="21"/>
         </w:rPr>
-        <w:t>PostgreSQL</w:t>
-      </w:r>
-      <w:proofErr w:type="spellEnd"/>
-      <w:r>
-        <w:rPr>
-          <w:sz w:val="21"/>
-          <w:szCs w:val="21"/>
-        </w:rPr>
-        <w:t xml:space="preserve"> JDBC Driver. https://jdbc.postgresql.org/ (acedido em 22/10/2026).</w:t>
+        <w:t>Node-RED. Documentação. https://nodered.org/docs/ (acedido em 22/10/2026).</w:t>
       </w:r>
     </w:p>
     <w:p>
@@ -18484,7 +18466,39 @@
           <w:sz w:val="21"/>
           <w:szCs w:val="21"/>
         </w:rPr>
-        <w:t>Node-RED. Documentação. https://nodered.org/docs/ (acedido em 22/10/2026).</w:t>
+        <w:t>node-</w:t>
+      </w:r>
+      <w:proofErr w:type="spellStart"/>
+      <w:r>
+        <w:rPr>
+          <w:sz w:val="21"/>
+          <w:szCs w:val="21"/>
+        </w:rPr>
+        <w:t>red</w:t>
+      </w:r>
+      <w:proofErr w:type="spellEnd"/>
+      <w:r>
+        <w:rPr>
+          <w:sz w:val="21"/>
+          <w:szCs w:val="21"/>
+        </w:rPr>
+        <w:t>-</w:t>
+      </w:r>
+      <w:proofErr w:type="spellStart"/>
+      <w:r>
+        <w:rPr>
+          <w:sz w:val="21"/>
+          <w:szCs w:val="21"/>
+        </w:rPr>
+        <w:t>dashboard</w:t>
+      </w:r>
+      <w:proofErr w:type="spellEnd"/>
+      <w:r>
+        <w:rPr>
+          <w:sz w:val="21"/>
+          <w:szCs w:val="21"/>
+        </w:rPr>
+        <w:t>. https://flows.nodered.org/node/node-red-dashboard (acedido em 22/10/2026).</w:t>
       </w:r>
     </w:p>
     <w:p>
@@ -18525,7 +18539,7 @@
           <w:sz w:val="21"/>
           <w:szCs w:val="21"/>
         </w:rPr>
-        <w:t>dashboard</w:t>
+        <w:t>contrib-postgresql</w:t>
       </w:r>
       <w:proofErr w:type="spellEnd"/>
       <w:r>
@@ -18533,7 +18547,7 @@
           <w:sz w:val="21"/>
           <w:szCs w:val="21"/>
         </w:rPr>
-        <w:t>. https://flows.nodered.org/node/node-red-dashboard (acedido em 22/10/2026).</w:t>
+        <w:t>. https://flows.nodered.org/node/node-red-contrib-postgresql (acedido em 22/10/2026).</w:t>
       </w:r>
     </w:p>
     <w:p>
@@ -18550,61 +18564,12 @@
           <w:sz w:val="21"/>
           <w:szCs w:val="21"/>
         </w:rPr>
-        <w:t>node-</w:t>
-      </w:r>
-      <w:proofErr w:type="spellStart"/>
-      <w:r>
-        <w:rPr>
-          <w:sz w:val="21"/>
-          <w:szCs w:val="21"/>
-        </w:rPr>
-        <w:t>red</w:t>
-      </w:r>
-      <w:proofErr w:type="spellEnd"/>
-      <w:r>
-        <w:rPr>
-          <w:sz w:val="21"/>
-          <w:szCs w:val="21"/>
-        </w:rPr>
-        <w:t>-</w:t>
-      </w:r>
-      <w:proofErr w:type="spellStart"/>
-      <w:r>
-        <w:rPr>
-          <w:sz w:val="21"/>
-          <w:szCs w:val="21"/>
-        </w:rPr>
-        <w:t>contrib-postgresql</w:t>
-      </w:r>
-      <w:proofErr w:type="spellEnd"/>
-      <w:r>
-        <w:rPr>
-          <w:sz w:val="21"/>
-          <w:szCs w:val="21"/>
-        </w:rPr>
-        <w:t>. https://flows.nodered.org/node/node-red-contrib-postgresql (acedido em 22/10/2026).</w:t>
-      </w:r>
-    </w:p>
-    <w:p>
-      <w:pPr>
-        <w:pStyle w:val="PargrafodaLista"/>
-        <w:numPr>
-          <w:ilvl w:val="0"/>
-          <w:numId w:val="3"/>
-        </w:numPr>
-        <w:spacing w:after="80" w:line="276" w:lineRule="auto"/>
-      </w:pPr>
-      <w:r>
-        <w:rPr>
-          <w:sz w:val="21"/>
-          <w:szCs w:val="21"/>
-        </w:rPr>
         <w:t>Ferreira, L. e Ribeiro, Ó. (2026). Enunciado do Trabalho Prático I, Integração de Sistemas de Informação, IPCA.</w:t>
       </w:r>
     </w:p>
     <w:sectPr>
-      <w:footerReference w:type="default" r:id="rId22"/>
-      <w:footerReference w:type="first" r:id="rId23"/>
+      <w:footerReference w:type="default" r:id="rId23"/>
+      <w:footerReference w:type="first" r:id="rId24"/>
       <w:pgSz w:w="11906" w:h="16838"/>
       <w:pgMar w:top="1134" w:right="1134" w:bottom="1134" w:left="1134" w:header="708" w:footer="708" w:gutter="0"/>
       <w:cols w:space="720"/>

</xml_diff>